<commit_message>
Week 8 Day 4 - finished
</commit_message>
<xml_diff>
--- a/week8/day4.PlanningAgent functional spec.docx
+++ b/week8/day4.PlanningAgent functional spec.docx
@@ -28,7 +28,7 @@
     <w:p>
       <w:r>
         <w:pict w14:anchorId="56833703">
-          <v:rect id="_x0000_i1061" style="width:0;height:1.5pt" o:hralign="center" o:hrstd="t" o:hr="t" fillcolor="#a0a0a0" stroked="f"/>
+          <v:rect id="_x0000_i1025" style="width:0;height:1.5pt" o:hralign="center" o:hrstd="t" o:hr="t" fillcolor="#a0a0a0" stroked="f"/>
         </w:pict>
       </w:r>
     </w:p>
@@ -159,7 +159,7 @@
     <w:p>
       <w:r>
         <w:pict w14:anchorId="02E24D8D">
-          <v:rect id="_x0000_i1062" style="width:0;height:1.5pt" o:hralign="center" o:hrstd="t" o:hr="t" fillcolor="#a0a0a0" stroked="f"/>
+          <v:rect id="_x0000_i1026" style="width:0;height:1.5pt" o:hralign="center" o:hrstd="t" o:hr="t" fillcolor="#a0a0a0" stroked="f"/>
         </w:pict>
       </w:r>
     </w:p>
@@ -259,6 +259,11 @@
       </w:pPr>
       <w:proofErr w:type="spellStart"/>
       <w:r>
+        <w:rPr>
+          <w:b/>
+          <w:bCs/>
+          <w:color w:val="EE0000"/>
+        </w:rPr>
         <w:t>ScannerAgent</w:t>
       </w:r>
       <w:proofErr w:type="spellEnd"/>
@@ -275,6 +280,11 @@
       </w:pPr>
       <w:proofErr w:type="spellStart"/>
       <w:r>
+        <w:rPr>
+          <w:b/>
+          <w:bCs/>
+          <w:color w:val="EE0000"/>
+        </w:rPr>
         <w:t>EnsembleAgent</w:t>
       </w:r>
       <w:proofErr w:type="spellEnd"/>
@@ -291,6 +301,11 @@
       </w:pPr>
       <w:proofErr w:type="spellStart"/>
       <w:r>
+        <w:rPr>
+          <w:b/>
+          <w:bCs/>
+          <w:color w:val="EE0000"/>
+        </w:rPr>
         <w:t>MessagingAgent</w:t>
       </w:r>
       <w:proofErr w:type="spellEnd"/>
@@ -329,7 +344,7 @@
     <w:p>
       <w:r>
         <w:pict w14:anchorId="3EC5DD6F">
-          <v:rect id="_x0000_i1063" style="width:0;height:1.5pt" o:hralign="center" o:hrstd="t" o:hr="t" fillcolor="#a0a0a0" stroked="f"/>
+          <v:rect id="_x0000_i1027" style="width:0;height:1.5pt" o:hralign="center" o:hrstd="t" o:hr="t" fillcolor="#a0a0a0" stroked="f"/>
         </w:pict>
       </w:r>
     </w:p>
@@ -509,7 +524,7 @@
     <w:p>
       <w:r>
         <w:pict w14:anchorId="47CCC28B">
-          <v:rect id="_x0000_i1064" style="width:0;height:1.5pt" o:hralign="center" o:hrstd="t" o:hr="t" fillcolor="#a0a0a0" stroked="f"/>
+          <v:rect id="_x0000_i1028" style="width:0;height:1.5pt" o:hralign="center" o:hrstd="t" o:hr="t" fillcolor="#a0a0a0" stroked="f"/>
         </w:pict>
       </w:r>
     </w:p>
@@ -828,7 +843,18 @@
         </w:numPr>
       </w:pPr>
       <w:r>
-        <w:t xml:space="preserve">Opportunity </w:t>
+        <w:rPr>
+          <w:b/>
+          <w:bCs/>
+          <w:color w:val="EE0000"/>
+        </w:rPr>
+        <w:t>Opportunity</w:t>
+      </w:r>
+      <w:r>
+        <w:rPr>
+          <w:color w:val="EE0000"/>
+        </w:rPr>
+        <w:t xml:space="preserve"> </w:t>
       </w:r>
       <w:r>
         <w:t>或</w:t>
@@ -849,7 +875,7 @@
     <w:p>
       <w:r>
         <w:pict w14:anchorId="15502976">
-          <v:rect id="_x0000_i1065" style="width:0;height:1.5pt" o:hralign="center" o:hrstd="t" o:hr="t" fillcolor="#a0a0a0" stroked="f"/>
+          <v:rect id="_x0000_i1029" style="width:0;height:1.5pt" o:hralign="center" o:hrstd="t" o:hr="t" fillcolor="#a0a0a0" stroked="f"/>
         </w:pict>
       </w:r>
     </w:p>
@@ -939,10 +965,26 @@
         <w:t xml:space="preserve">DEAL_THRESHOLD: </w:t>
       </w:r>
       <w:r>
-        <w:t>折扣門檻，數值預設為</w:t>
-      </w:r>
-      <w:r>
-        <w:t xml:space="preserve"> 50</w:t>
+        <w:rPr>
+          <w:b/>
+          <w:bCs/>
+          <w:color w:val="EE0000"/>
+        </w:rPr>
+        <w:t>折扣門檻</w:t>
+      </w:r>
+      <w:r>
+        <w:t>，數值預設為</w:t>
+      </w:r>
+      <w:r>
+        <w:t xml:space="preserve"> </w:t>
+      </w:r>
+      <w:r>
+        <w:rPr>
+          <w:b/>
+          <w:bCs/>
+          <w:color w:val="EE0000"/>
+        </w:rPr>
+        <w:t>50</w:t>
       </w:r>
       <w:r>
         <w:t>。</w:t>
@@ -951,7 +993,7 @@
     <w:p>
       <w:r>
         <w:pict w14:anchorId="3F535AF9">
-          <v:rect id="_x0000_i1066" style="width:0;height:1.5pt" o:hralign="center" o:hrstd="t" o:hr="t" fillcolor="#a0a0a0" stroked="f"/>
+          <v:rect id="_x0000_i1030" style="width:0;height:1.5pt" o:hralign="center" o:hrstd="t" o:hr="t" fillcolor="#a0a0a0" stroked="f"/>
         </w:pict>
       </w:r>
     </w:p>
@@ -2754,6 +2796,7 @@
   <w:style w:type="character" w:default="1" w:styleId="DefaultParagraphFont">
     <w:name w:val="Default Paragraph Font"/>
     <w:uiPriority w:val="1"/>
+    <w:semiHidden/>
     <w:unhideWhenUsed/>
   </w:style>
   <w:style w:type="table" w:default="1" w:styleId="TableNormal">

</xml_diff>